<commit_message>
Format all amount fields with thousand separators
Added GlService.fmtAmount() - converts 1000000.00 to 1,000,000.00
Applied across 7 finance screens: balance sheet, P&L, journal entry,
journal entry list, account balance, account ledger, dashboard

Fixed TestUpdateDraftEntry assertion
</commit_message>
<xml_diff>
--- a/StartServer.docx
+++ b/StartServer.docx
@@ -21,6 +21,19 @@
           <w:rFonts w:hint="default"/>
         </w:rPr>
       </w:pPr>
+      <w:r>
+        <w:rPr>
+          <w:rFonts w:hint="default"/>
+        </w:rPr>
+        <w:t>git push -u origin main</w:t>
+      </w:r>
+    </w:p>
+    <w:p>
+      <w:pPr>
+        <w:rPr>
+          <w:rFonts w:hint="default"/>
+        </w:rPr>
+      </w:pPr>
     </w:p>
     <w:p>
       <w:pPr>
@@ -131,126 +144,211 @@
         <w:rPr>
           <w:rFonts w:hint="default"/>
         </w:rPr>
-        <w:t xml:space="preserve"> 后端 (Go)</w:t>
-      </w:r>
-    </w:p>
-    <w:p>
-      <w:pPr>
-        <w:rPr>
-          <w:rFonts w:hint="default"/>
-        </w:rPr>
-      </w:pPr>
-    </w:p>
-    <w:p>
-      <w:pPr>
-        <w:rPr>
-          <w:rFonts w:hint="default"/>
-        </w:rPr>
-      </w:pPr>
-      <w:r>
-        <w:rPr>
-          <w:rFonts w:hint="default"/>
-        </w:rPr>
-        <w:t>cd C:\SwiftAIERP\backend</w:t>
-      </w:r>
-    </w:p>
-    <w:p>
-      <w:pPr>
-        <w:rPr>
-          <w:rFonts w:hint="default"/>
-        </w:rPr>
-      </w:pPr>
-    </w:p>
-    <w:p>
-      <w:pPr>
-        <w:rPr>
-          <w:rFonts w:hint="default"/>
-        </w:rPr>
-      </w:pPr>
-      <w:r>
-        <w:rPr>
-          <w:rFonts w:hint="default"/>
-        </w:rPr>
-        <w:t># 编译（改代码后必须）</w:t>
-      </w:r>
-    </w:p>
-    <w:p>
-      <w:pPr>
-        <w:rPr>
-          <w:rFonts w:hint="default"/>
-        </w:rPr>
-      </w:pPr>
-      <w:r>
-        <w:rPr>
-          <w:rFonts w:hint="default"/>
-        </w:rPr>
-        <w:t>go build -o auth-service.exe ./cmd/auth-service</w:t>
-      </w:r>
-    </w:p>
-    <w:p>
-      <w:pPr>
-        <w:rPr>
-          <w:rFonts w:hint="default"/>
-        </w:rPr>
-      </w:pPr>
-      <w:r>
-        <w:rPr>
-          <w:rFonts w:hint="default"/>
-        </w:rPr>
-        <w:t>go build -o api-gateway.exe ./cmd/api-gateway</w:t>
-      </w:r>
-    </w:p>
-    <w:p>
-      <w:pPr>
-        <w:rPr>
-          <w:rFonts w:hint="default"/>
-        </w:rPr>
-      </w:pPr>
-    </w:p>
-    <w:p>
-      <w:pPr>
-        <w:rPr>
-          <w:rFonts w:hint="default"/>
-        </w:rPr>
-      </w:pPr>
-      <w:r>
-        <w:rPr>
-          <w:rFonts w:hint="default"/>
-        </w:rPr>
-        <w:t># 启动（两个窗口分别跑，或用 Start-Process）</w:t>
-      </w:r>
-    </w:p>
-    <w:p>
-      <w:pPr>
-        <w:rPr>
-          <w:rFonts w:hint="default"/>
-        </w:rPr>
-      </w:pPr>
-    </w:p>
-    <w:p>
-      <w:pPr>
-        <w:rPr>
-          <w:rFonts w:hint="default"/>
-        </w:rPr>
-      </w:pPr>
-      <w:r>
-        <w:rPr>
-          <w:rFonts w:hint="default"/>
-        </w:rPr>
-        <w:t>go run .\cmd\auth-service\</w:t>
-      </w:r>
-    </w:p>
-    <w:p>
-      <w:pPr>
-        <w:rPr>
-          <w:rFonts w:hint="default"/>
-        </w:rPr>
-      </w:pPr>
-      <w:r>
-        <w:rPr>
-          <w:rFonts w:hint="default"/>
-        </w:rPr>
-        <w:t>go run .\cmd\api-gateway\</w:t>
+        <w:t xml:space="preserve"> cd C:\SwiftAIERP\backend</w:t>
+      </w:r>
+    </w:p>
+    <w:p>
+      <w:pPr>
+        <w:rPr>
+          <w:rFonts w:hint="default"/>
+        </w:rPr>
+      </w:pPr>
+    </w:p>
+    <w:p>
+      <w:pPr>
+        <w:rPr>
+          <w:rFonts w:hint="default"/>
+        </w:rPr>
+      </w:pPr>
+      <w:r>
+        <w:rPr>
+          <w:rFonts w:hint="default"/>
+        </w:rPr>
+        <w:t>:: ========== 后端重建 + 重启 ==========</w:t>
+      </w:r>
+    </w:p>
+    <w:p>
+      <w:pPr>
+        <w:rPr>
+          <w:rFonts w:hint="default"/>
+        </w:rPr>
+      </w:pPr>
+    </w:p>
+    <w:p>
+      <w:pPr>
+        <w:rPr>
+          <w:rFonts w:hint="default"/>
+        </w:rPr>
+      </w:pPr>
+      <w:r>
+        <w:rPr>
+          <w:rFonts w:hint="default"/>
+        </w:rPr>
+        <w:t>:: 1. 杀掉旧进程</w:t>
+      </w:r>
+    </w:p>
+    <w:p>
+      <w:pPr>
+        <w:rPr>
+          <w:rFonts w:hint="default"/>
+        </w:rPr>
+      </w:pPr>
+      <w:r>
+        <w:rPr>
+          <w:rFonts w:hint="default"/>
+        </w:rPr>
+        <w:t>taskkill /f /im auth-service.exe 2&gt;nul</w:t>
+      </w:r>
+    </w:p>
+    <w:p>
+      <w:pPr>
+        <w:rPr>
+          <w:rFonts w:hint="default"/>
+        </w:rPr>
+      </w:pPr>
+      <w:r>
+        <w:rPr>
+          <w:rFonts w:hint="default"/>
+        </w:rPr>
+        <w:t>taskkill /f /im api-gateway.exe 2&gt;nul</w:t>
+      </w:r>
+    </w:p>
+    <w:p>
+      <w:pPr>
+        <w:rPr>
+          <w:rFonts w:hint="default"/>
+        </w:rPr>
+      </w:pPr>
+    </w:p>
+    <w:p>
+      <w:pPr>
+        <w:rPr>
+          <w:rFonts w:hint="default"/>
+        </w:rPr>
+      </w:pPr>
+      <w:r>
+        <w:rPr>
+          <w:rFonts w:hint="default"/>
+        </w:rPr>
+        <w:t>:: 2. 编译</w:t>
+      </w:r>
+    </w:p>
+    <w:p>
+      <w:pPr>
+        <w:rPr>
+          <w:rFonts w:hint="default"/>
+        </w:rPr>
+      </w:pPr>
+      <w:r>
+        <w:rPr>
+          <w:rFonts w:hint="default"/>
+        </w:rPr>
+        <w:t>go build -o auth-service.exe ./cmd/auth-service/</w:t>
+      </w:r>
+    </w:p>
+    <w:p>
+      <w:pPr>
+        <w:rPr>
+          <w:rFonts w:hint="default"/>
+        </w:rPr>
+      </w:pPr>
+      <w:r>
+        <w:rPr>
+          <w:rFonts w:hint="default"/>
+        </w:rPr>
+        <w:t>go build -o api-gateway.exe ./cmd/api-gateway/</w:t>
+      </w:r>
+    </w:p>
+    <w:p>
+      <w:pPr>
+        <w:rPr>
+          <w:rFonts w:hint="default"/>
+        </w:rPr>
+      </w:pPr>
+    </w:p>
+    <w:p>
+      <w:pPr>
+        <w:rPr>
+          <w:rFonts w:hint="default"/>
+        </w:rPr>
+      </w:pPr>
+      <w:r>
+        <w:rPr>
+          <w:rFonts w:hint="default"/>
+        </w:rPr>
+        <w:t>:: 3. 启动</w:t>
+      </w:r>
+    </w:p>
+    <w:p>
+      <w:pPr>
+        <w:rPr>
+          <w:rFonts w:hint="default"/>
+        </w:rPr>
+      </w:pPr>
+      <w:r>
+        <w:rPr>
+          <w:rFonts w:hint="default"/>
+        </w:rPr>
+        <w:t>start /B auth-service.exe</w:t>
+      </w:r>
+    </w:p>
+    <w:p>
+      <w:pPr>
+        <w:rPr>
+          <w:rFonts w:hint="default"/>
+        </w:rPr>
+      </w:pPr>
+      <w:r>
+        <w:rPr>
+          <w:rFonts w:hint="default"/>
+        </w:rPr>
+        <w:t>start /B api-gateway.exe</w:t>
+      </w:r>
+    </w:p>
+    <w:p>
+      <w:pPr>
+        <w:rPr>
+          <w:rFonts w:hint="default"/>
+        </w:rPr>
+      </w:pPr>
+    </w:p>
+    <w:p>
+      <w:pPr>
+        <w:rPr>
+          <w:rFonts w:hint="default"/>
+        </w:rPr>
+      </w:pPr>
+      <w:r>
+        <w:rPr>
+          <w:rFonts w:hint="default"/>
+        </w:rPr>
+        <w:t>:: 4. 确认</w:t>
+      </w:r>
+    </w:p>
+    <w:p>
+      <w:pPr>
+        <w:rPr>
+          <w:rFonts w:hint="default"/>
+        </w:rPr>
+      </w:pPr>
+      <w:r>
+        <w:rPr>
+          <w:rFonts w:hint="default"/>
+        </w:rPr>
+        <w:t>timeout /t 3 /nobreak &gt;nul</w:t>
+      </w:r>
+    </w:p>
+    <w:p>
+      <w:pPr>
+        <w:rPr>
+          <w:rFonts w:hint="default"/>
+        </w:rPr>
+      </w:pPr>
+      <w:r>
+        <w:rPr>
+          <w:rFonts w:hint="default"/>
+        </w:rPr>
+        <w:t>tasklist | findstr "auth-service"</w:t>
       </w:r>
     </w:p>
     <w:p>
@@ -275,105 +373,26 @@
           <w:rFonts w:hint="default"/>
         </w:rPr>
       </w:pPr>
-      <w:r>
-        <w:rPr>
-          <w:rFonts w:hint="default"/>
-        </w:rPr>
-        <w:t>Start-Process -NoNewWindow -FilePath ".\auth-service.exe"</w:t>
-      </w:r>
-    </w:p>
-    <w:p>
-      <w:pPr>
-        <w:rPr>
-          <w:rFonts w:hint="default"/>
-        </w:rPr>
-      </w:pPr>
-      <w:r>
-        <w:rPr>
-          <w:rFonts w:hint="default"/>
-        </w:rPr>
-        <w:t>Start-Process -NoNewWindow -FilePath ".\api-gateway.exe"</w:t>
-      </w:r>
-    </w:p>
-    <w:p>
-      <w:pPr>
-        <w:rPr>
-          <w:rFonts w:hint="default"/>
-        </w:rPr>
-      </w:pPr>
-    </w:p>
-    <w:p>
-      <w:pPr>
-        <w:rPr>
-          <w:rFonts w:hint="default"/>
-        </w:rPr>
-      </w:pPr>
-      <w:r>
-        <w:rPr>
-          <w:rFonts w:hint="default"/>
-        </w:rPr>
-        <w:t># 验证</w:t>
-      </w:r>
-    </w:p>
-    <w:p>
-      <w:pPr>
-        <w:rPr>
-          <w:rFonts w:hint="default"/>
-        </w:rPr>
-      </w:pPr>
-      <w:r>
-        <w:rPr>
-          <w:rFonts w:hint="default"/>
-        </w:rPr>
-        <w:t>curl.exe http://localhost:8081/health   # auth-service</w:t>
-      </w:r>
-    </w:p>
-    <w:p>
-      <w:pPr>
-        <w:rPr>
-          <w:rFonts w:hint="default"/>
-        </w:rPr>
-      </w:pPr>
-      <w:r>
-        <w:rPr>
-          <w:rFonts w:hint="default"/>
-        </w:rPr>
-        <w:t>curl.exe http://localhost:8080/health   # api-gateway</w:t>
-      </w:r>
-    </w:p>
-    <w:p>
-      <w:pPr>
-        <w:rPr>
-          <w:rFonts w:hint="default"/>
-        </w:rPr>
-      </w:pPr>
-    </w:p>
-    <w:p>
-      <w:pPr>
-        <w:rPr>
-          <w:rFonts w:hint="default"/>
-        </w:rPr>
-      </w:pPr>
-    </w:p>
-    <w:p>
-      <w:pPr>
-        <w:rPr>
-          <w:rFonts w:hint="default"/>
-        </w:rPr>
-      </w:pPr>
-      <w:r>
-        <w:rPr>
-          <w:rFonts w:hint="default"/>
-        </w:rPr>
-        <w:t>前端 (Flutter)</w:t>
-      </w:r>
-    </w:p>
-    <w:p>
-      <w:pPr>
-        <w:rPr>
-          <w:rFonts w:hint="default"/>
-        </w:rPr>
-      </w:pPr>
+    </w:p>
+    <w:p>
+      <w:pPr>
+        <w:rPr>
+          <w:rFonts w:hint="default"/>
+        </w:rPr>
+      </w:pPr>
+    </w:p>
+    <w:p>
+      <w:pPr>
+        <w:rPr>
+          <w:rFonts w:hint="default"/>
+        </w:rPr>
+      </w:pPr>
+      <w:r>
+        <w:rPr>
+          <w:rFonts w:hint="default"/>
+        </w:rPr>
+        <w:t>:: ========== 前端 ==========</w:t>
+      </w:r>
     </w:p>
     <w:p>
       <w:pPr>
@@ -401,11 +420,18 @@
           <w:rFonts w:hint="default"/>
         </w:rPr>
       </w:pPr>
-      <w:r>
-        <w:rPr>
-          <w:rFonts w:hint="default"/>
-        </w:rPr>
-        <w:t># 检查依赖</w:t>
+    </w:p>
+    <w:p>
+      <w:pPr>
+        <w:rPr>
+          <w:rFonts w:hint="default"/>
+        </w:rPr>
+      </w:pPr>
+      <w:r>
+        <w:rPr>
+          <w:rFonts w:hint="default"/>
+        </w:rPr>
+        <w:t>:: 1. 安装依赖（首次或新增包时执行）</w:t>
       </w:r>
     </w:p>
     <w:p>
@@ -438,34 +464,74 @@
         <w:rPr>
           <w:rFonts w:hint="default"/>
         </w:rPr>
-        <w:t># 启动（选一个）</w:t>
-      </w:r>
-    </w:p>
-    <w:p>
-      <w:pPr>
-        <w:rPr>
-          <w:rFonts w:hint="default"/>
-        </w:rPr>
-      </w:pPr>
-      <w:r>
-        <w:rPr>
-          <w:rFonts w:hint="default"/>
-        </w:rPr>
-        <w:t>flutter run -d chrome       # Web 开发</w:t>
-      </w:r>
-    </w:p>
-    <w:p>
-      <w:pPr>
-        <w:rPr>
-          <w:rFonts w:hint="default"/>
-        </w:rPr>
-      </w:pPr>
-      <w:r>
-        <w:rPr>
-          <w:rFonts w:hint="default"/>
-        </w:rPr>
-        <w:t>flutter run -d windows      # Windows 桌面</w:t>
-      </w:r>
+        <w:t>:: 2. 代码检查</w:t>
+      </w:r>
+    </w:p>
+    <w:p>
+      <w:pPr>
+        <w:rPr>
+          <w:rFonts w:hint="default"/>
+        </w:rPr>
+      </w:pPr>
+      <w:r>
+        <w:rPr>
+          <w:rFonts w:hint="default"/>
+        </w:rPr>
+        <w:t>flutter analyze</w:t>
+      </w:r>
+    </w:p>
+    <w:p>
+      <w:pPr>
+        <w:rPr>
+          <w:rFonts w:hint="default"/>
+        </w:rPr>
+      </w:pPr>
+    </w:p>
+    <w:p>
+      <w:pPr>
+        <w:rPr>
+          <w:rFonts w:hint="default"/>
+        </w:rPr>
+      </w:pPr>
+      <w:r>
+        <w:rPr>
+          <w:rFonts w:hint="default"/>
+        </w:rPr>
+        <w:t>:: 3. 运行</w:t>
+      </w:r>
+    </w:p>
+    <w:p>
+      <w:pPr>
+        <w:rPr>
+          <w:rFonts w:hint="default"/>
+        </w:rPr>
+      </w:pPr>
+      <w:r>
+        <w:rPr>
+          <w:rFonts w:hint="default"/>
+        </w:rPr>
+        <w:t>flutter run -d chrome   (Web)</w:t>
+      </w:r>
+    </w:p>
+    <w:p>
+      <w:pPr>
+        <w:rPr>
+          <w:rFonts w:hint="default"/>
+        </w:rPr>
+      </w:pPr>
+      <w:r>
+        <w:rPr>
+          <w:rFonts w:hint="default"/>
+        </w:rPr>
+        <w:t>flutter run -d windows  (Windows 桌面)</w:t>
+      </w:r>
+    </w:p>
+    <w:p>
+      <w:pPr>
+        <w:rPr>
+          <w:rFonts w:hint="default"/>
+        </w:rPr>
+      </w:pPr>
     </w:p>
     <w:p>
       <w:pPr>

</xml_diff>

<commit_message>
feat: major ERP enhancements
- GL: Journal entry screen overhaul with full draft/post/reverse workflow
- GL: Account balance tracking, reports (Balance Sheet, P&L)
- GL: Settings integration (Finance Settings, Periods, COA)
- Warehouse: Full WMS module (products, warehouses, zones, bins, stock)
- Warehouse: Stock movements, goods receipt, outbound, cycle counts
- Purchase: PO management, goods receipt, vendor management
- Purchase: Invoice 3-way match (MIRO) with partial invoice, price diff
- Settings: Org structure tree, Finance Settings (Account Types, Periods)
- Infra: Docker compose, auth service restructuring, NSSM service setup

Breaking: Removed old api-gateway, consolidated into auth-service
</commit_message>
<xml_diff>
--- a/StartServer.docx
+++ b/StartServer.docx
@@ -6,6 +6,58 @@
       <w:pPr>
         <w:rPr>
           <w:rFonts w:hint="default"/>
+          <w:lang w:val="en-US"/>
+        </w:rPr>
+      </w:pPr>
+      <w:r>
+        <w:rPr>
+          <w:rFonts w:hint="default"/>
+          <w:lang w:val="en-US"/>
+        </w:rPr>
+        <w:t xml:space="preserve">Git hub backup </w:t>
+      </w:r>
+    </w:p>
+    <w:p>
+      <w:pPr>
+        <w:rPr>
+          <w:rFonts w:hint="default"/>
+        </w:rPr>
+      </w:pPr>
+      <w:r>
+        <w:rPr>
+          <w:rFonts w:hint="default"/>
+        </w:rPr>
+        <w:t>git push -u origin main</w:t>
+      </w:r>
+    </w:p>
+    <w:p>
+      <w:pPr>
+        <w:rPr>
+          <w:rFonts w:hint="default"/>
+          <w:lang w:val="en-US"/>
+        </w:rPr>
+      </w:pPr>
+    </w:p>
+    <w:p>
+      <w:pPr>
+        <w:rPr>
+          <w:rFonts w:hint="default"/>
+          <w:lang w:val="en-US"/>
+        </w:rPr>
+      </w:pPr>
+    </w:p>
+    <w:p>
+      <w:pPr>
+        <w:rPr>
+          <w:rFonts w:hint="default"/>
+          <w:lang w:val="en-US"/>
+        </w:rPr>
+      </w:pPr>
+    </w:p>
+    <w:p>
+      <w:pPr>
+        <w:rPr>
+          <w:rFonts w:hint="default"/>
         </w:rPr>
       </w:pPr>
       <w:r>
@@ -21,12 +73,432 @@
           <w:rFonts w:hint="default"/>
         </w:rPr>
       </w:pPr>
-      <w:r>
-        <w:rPr>
-          <w:rFonts w:hint="default"/>
-        </w:rPr>
-        <w:t>git push -u origin main</w:t>
-      </w:r>
+    </w:p>
+    <w:p>
+      <w:pPr>
+        <w:keepNext w:val="0"/>
+        <w:keepLines w:val="0"/>
+        <w:widowControl/>
+        <w:suppressLineNumbers w:val="0"/>
+        <w:jc w:val="left"/>
+        <w:rPr>
+          <w:rFonts w:ascii="SimSun" w:hAnsi="SimSun" w:eastAsia="SimSun" w:cs="SimSun"/>
+          <w:kern w:val="0"/>
+          <w:sz w:val="24"/>
+          <w:szCs w:val="24"/>
+          <w:lang w:val="en-US" w:eastAsia="zh-CN" w:bidi="ar"/>
+        </w:rPr>
+      </w:pPr>
+      <w:r>
+        <w:rPr>
+          <w:rFonts w:ascii="SimSun" w:hAnsi="SimSun" w:eastAsia="SimSun" w:cs="SimSun"/>
+          <w:kern w:val="0"/>
+          <w:sz w:val="24"/>
+          <w:szCs w:val="24"/>
+          <w:lang w:val="en-US" w:eastAsia="zh-CN" w:bidi="ar"/>
+        </w:rPr>
+        <w:t>端口 8080 被占用了。先查是谁在用，然后清理</w:t>
+      </w:r>
+      <w:r>
+        <w:rPr>
+          <w:rFonts w:hint="eastAsia" w:ascii="SimSun" w:hAnsi="SimSun" w:eastAsia="SimSun" w:cs="SimSun"/>
+          <w:kern w:val="0"/>
+          <w:sz w:val="24"/>
+          <w:szCs w:val="24"/>
+          <w:lang w:val="en-US" w:eastAsia="zh-CN" w:bidi="ar"/>
+        </w:rPr>
+        <w:t>，使用powershell</w:t>
+      </w:r>
+      <w:r>
+        <w:rPr>
+          <w:rFonts w:ascii="SimSun" w:hAnsi="SimSun" w:eastAsia="SimSun" w:cs="SimSun"/>
+          <w:kern w:val="0"/>
+          <w:sz w:val="24"/>
+          <w:szCs w:val="24"/>
+          <w:lang w:val="en-US" w:eastAsia="zh-CN" w:bidi="ar"/>
+        </w:rPr>
+        <w:t>：</w:t>
+      </w:r>
+      <w:r>
+        <w:rPr>
+          <w:rFonts w:ascii="SimSun" w:hAnsi="SimSun" w:eastAsia="SimSun" w:cs="SimSun"/>
+          <w:kern w:val="0"/>
+          <w:sz w:val="24"/>
+          <w:szCs w:val="24"/>
+          <w:lang w:val="en-US" w:eastAsia="zh-CN" w:bidi="ar"/>
+        </w:rPr>
+        <w:br w:type="textWrapping"/>
+      </w:r>
+    </w:p>
+    <w:p>
+      <w:pPr>
+        <w:keepNext w:val="0"/>
+        <w:keepLines w:val="0"/>
+        <w:widowControl/>
+        <w:suppressLineNumbers w:val="0"/>
+        <w:jc w:val="left"/>
+      </w:pPr>
+      <w:r>
+        <w:rPr>
+          <w:rFonts w:ascii="SimSun" w:hAnsi="SimSun" w:eastAsia="SimSun" w:cs="SimSun"/>
+          <w:kern w:val="0"/>
+          <w:sz w:val="24"/>
+          <w:szCs w:val="24"/>
+          <w:lang w:val="en-US" w:eastAsia="zh-CN" w:bidi="ar"/>
+        </w:rPr>
+        <w:t>之前跑的前端进程还占着 3000，先杀掉再启动：</w:t>
+      </w:r>
+    </w:p>
+    <w:p>
+      <w:pPr>
+        <w:pStyle w:val="4"/>
+        <w:keepNext w:val="0"/>
+        <w:keepLines w:val="0"/>
+        <w:widowControl/>
+        <w:suppressLineNumbers w:val="0"/>
+      </w:pPr>
+      <w:r>
+        <w:t>taskkill /F /IM dart.exe 2&gt;$null; flutter run -d web-server --web-port 3000 --web-hostname 0.0.0.0</w:t>
+      </w:r>
+    </w:p>
+    <w:p>
+      <w:pPr>
+        <w:keepNext w:val="0"/>
+        <w:keepLines w:val="0"/>
+        <w:widowControl/>
+        <w:suppressLineNumbers w:val="0"/>
+        <w:jc w:val="left"/>
+      </w:pPr>
+    </w:p>
+    <w:p>
+      <w:pPr>
+        <w:keepNext w:val="0"/>
+        <w:keepLines w:val="0"/>
+        <w:widowControl/>
+        <w:suppressLineNumbers w:val="0"/>
+        <w:jc w:val="left"/>
+        <w:rPr>
+          <w:rFonts w:ascii="SimSun" w:hAnsi="SimSun" w:eastAsia="SimSun" w:cs="SimSun"/>
+          <w:kern w:val="0"/>
+          <w:sz w:val="24"/>
+          <w:szCs w:val="24"/>
+          <w:lang w:val="en-US" w:eastAsia="zh-CN" w:bidi="ar"/>
+        </w:rPr>
+      </w:pPr>
+      <w:bookmarkStart w:id="0" w:name="_GoBack"/>
+      <w:bookmarkEnd w:id="0"/>
+    </w:p>
+    <w:p>
+      <w:pPr>
+        <w:keepNext w:val="0"/>
+        <w:keepLines w:val="0"/>
+        <w:widowControl/>
+        <w:suppressLineNumbers w:val="0"/>
+        <w:jc w:val="left"/>
+      </w:pPr>
+      <w:r>
+        <w:rPr>
+          <w:rFonts w:ascii="SimSun" w:hAnsi="SimSun" w:eastAsia="SimSun" w:cs="SimSun"/>
+          <w:kern w:val="0"/>
+          <w:sz w:val="24"/>
+          <w:szCs w:val="24"/>
+          <w:lang w:val="en-US" w:eastAsia="zh-CN" w:bidi="ar"/>
+        </w:rPr>
+        <w:br w:type="textWrapping"/>
+      </w:r>
+      <w:r>
+        <w:rPr>
+          <w:rFonts w:ascii="SimSun" w:hAnsi="SimSun" w:eastAsia="SimSun" w:cs="SimSun"/>
+          <w:kern w:val="0"/>
+          <w:sz w:val="24"/>
+          <w:szCs w:val="24"/>
+          <w:lang w:val="en-US" w:eastAsia="zh-CN" w:bidi="ar"/>
+        </w:rPr>
+        <w:t># 查看占用 8080 端口的进程 ID</w:t>
+      </w:r>
+      <w:r>
+        <w:rPr>
+          <w:rFonts w:ascii="SimSun" w:hAnsi="SimSun" w:eastAsia="SimSun" w:cs="SimSun"/>
+          <w:kern w:val="0"/>
+          <w:sz w:val="24"/>
+          <w:szCs w:val="24"/>
+          <w:lang w:val="en-US" w:eastAsia="zh-CN" w:bidi="ar"/>
+        </w:rPr>
+        <w:br w:type="textWrapping"/>
+      </w:r>
+      <w:r>
+        <w:rPr>
+          <w:rFonts w:ascii="SimSun" w:hAnsi="SimSun" w:eastAsia="SimSun" w:cs="SimSun"/>
+          <w:kern w:val="0"/>
+          <w:sz w:val="24"/>
+          <w:szCs w:val="24"/>
+          <w:lang w:val="en-US" w:eastAsia="zh-CN" w:bidi="ar"/>
+        </w:rPr>
+        <w:t>netstat -ano | findstr :8080</w:t>
+      </w:r>
+    </w:p>
+    <w:p>
+      <w:pPr>
+        <w:rPr>
+          <w:rFonts w:hint="default"/>
+        </w:rPr>
+      </w:pPr>
+    </w:p>
+    <w:p>
+      <w:pPr>
+        <w:pStyle w:val="4"/>
+        <w:keepNext w:val="0"/>
+        <w:keepLines w:val="0"/>
+        <w:widowControl/>
+        <w:suppressLineNumbers w:val="0"/>
+      </w:pPr>
+      <w:r>
+        <w:t># 杀掉该进程（把最后一列的 PID 替换进去）</w:t>
+      </w:r>
+    </w:p>
+    <w:p>
+      <w:pPr>
+        <w:pStyle w:val="4"/>
+        <w:keepNext w:val="0"/>
+        <w:keepLines w:val="0"/>
+        <w:widowControl/>
+        <w:suppressLineNumbers w:val="0"/>
+      </w:pPr>
+      <w:r>
+        <w:t>taskkill /F /PID &lt;PID号码&gt;</w:t>
+      </w:r>
+    </w:p>
+    <w:p>
+      <w:pPr>
+        <w:rPr>
+          <w:rFonts w:hint="default"/>
+        </w:rPr>
+      </w:pPr>
+    </w:p>
+    <w:p>
+      <w:pPr>
+        <w:keepNext w:val="0"/>
+        <w:keepLines w:val="0"/>
+        <w:widowControl/>
+        <w:suppressLineNumbers w:val="0"/>
+        <w:spacing w:after="240" w:afterAutospacing="0"/>
+        <w:jc w:val="left"/>
+      </w:pPr>
+      <w:r>
+        <w:rPr>
+          <w:rFonts w:ascii="SimSun" w:hAnsi="SimSun" w:eastAsia="SimSun" w:cs="SimSun"/>
+          <w:kern w:val="0"/>
+          <w:sz w:val="24"/>
+          <w:szCs w:val="24"/>
+          <w:lang w:val="en-US" w:eastAsia="zh-CN" w:bidi="ar"/>
+        </w:rPr>
+        <w:t>或者一步到位杀掉所有残余的 Go 进程：</w:t>
+      </w:r>
+    </w:p>
+    <w:p>
+      <w:pPr>
+        <w:pStyle w:val="4"/>
+        <w:keepNext w:val="0"/>
+        <w:keepLines w:val="0"/>
+        <w:widowControl/>
+        <w:suppressLineNumbers w:val="0"/>
+      </w:pPr>
+      <w:r>
+        <w:t>taskkill /F /IM go.exe</w:t>
+      </w:r>
+    </w:p>
+    <w:p>
+      <w:pPr>
+        <w:rPr>
+          <w:rFonts w:hint="default"/>
+        </w:rPr>
+      </w:pPr>
+    </w:p>
+    <w:p>
+      <w:pPr>
+        <w:keepNext w:val="0"/>
+        <w:keepLines w:val="0"/>
+        <w:widowControl/>
+        <w:suppressLineNumbers w:val="0"/>
+        <w:spacing w:after="240" w:afterAutospacing="0"/>
+        <w:jc w:val="left"/>
+      </w:pPr>
+      <w:r>
+        <w:rPr>
+          <w:rFonts w:ascii="SimSun" w:hAnsi="SimSun" w:eastAsia="SimSun" w:cs="SimSun"/>
+          <w:kern w:val="0"/>
+          <w:sz w:val="24"/>
+          <w:szCs w:val="24"/>
+          <w:lang w:val="en-US" w:eastAsia="zh-CN" w:bidi="ar"/>
+        </w:rPr>
+        <w:t>然后重新启动：</w:t>
+      </w:r>
+    </w:p>
+    <w:p>
+      <w:pPr>
+        <w:pStyle w:val="4"/>
+        <w:keepNext w:val="0"/>
+        <w:keepLines w:val="0"/>
+        <w:widowControl/>
+        <w:suppressLineNumbers w:val="0"/>
+      </w:pPr>
+      <w:r>
+        <w:t>cd C:\SwiftAIERP\backend</w:t>
+      </w:r>
+    </w:p>
+    <w:p>
+      <w:pPr>
+        <w:pStyle w:val="4"/>
+        <w:keepNext w:val="0"/>
+        <w:keepLines w:val="0"/>
+        <w:widowControl/>
+        <w:suppressLineNumbers w:val="0"/>
+      </w:pPr>
+      <w:r>
+        <w:t>go run .\cmd\api-gateway</w:t>
+      </w:r>
+    </w:p>
+    <w:p>
+      <w:pPr>
+        <w:keepNext w:val="0"/>
+        <w:keepLines w:val="0"/>
+        <w:widowControl/>
+        <w:suppressLineNumbers w:val="0"/>
+        <w:jc w:val="left"/>
+      </w:pPr>
+      <w:r>
+        <w:rPr>
+          <w:rFonts w:hint="eastAsia" w:ascii="SimSun" w:hAnsi="SimSun" w:eastAsia="SimSun" w:cs="SimSun"/>
+          <w:kern w:val="0"/>
+          <w:sz w:val="24"/>
+          <w:szCs w:val="24"/>
+          <w:lang w:val="en-US" w:eastAsia="zh-CN" w:bidi="ar"/>
+        </w:rPr>
+        <w:t>g</w:t>
+      </w:r>
+      <w:r>
+        <w:rPr>
+          <w:rFonts w:ascii="SimSun" w:hAnsi="SimSun" w:eastAsia="SimSun" w:cs="SimSun"/>
+          <w:kern w:val="0"/>
+          <w:sz w:val="24"/>
+          <w:szCs w:val="24"/>
+          <w:lang w:val="en-US" w:eastAsia="zh-CN" w:bidi="ar"/>
+        </w:rPr>
+        <w:t xml:space="preserve">o run </w:t>
+      </w:r>
+      <w:r>
+        <w:rPr>
+          <w:rFonts w:hint="default" w:ascii="SimSun" w:hAnsi="SimSun" w:eastAsia="SimSun" w:cs="SimSun"/>
+          <w:kern w:val="0"/>
+          <w:sz w:val="24"/>
+          <w:szCs w:val="24"/>
+          <w:lang w:val="en-US" w:eastAsia="zh-CN" w:bidi="ar"/>
+        </w:rPr>
+        <w:t>.</w:t>
+      </w:r>
+      <w:r>
+        <w:t>\cmd\auth-service</w:t>
+      </w:r>
+    </w:p>
+    <w:p>
+      <w:pPr>
+        <w:pStyle w:val="4"/>
+        <w:keepNext w:val="0"/>
+        <w:keepLines w:val="0"/>
+        <w:widowControl/>
+        <w:suppressLineNumbers w:val="0"/>
+      </w:pPr>
+    </w:p>
+    <w:p>
+      <w:pPr>
+        <w:rPr>
+          <w:rFonts w:hint="default"/>
+        </w:rPr>
+      </w:pPr>
+    </w:p>
+    <w:p>
+      <w:pPr>
+        <w:rPr>
+          <w:rFonts w:hint="default"/>
+        </w:rPr>
+      </w:pPr>
+    </w:p>
+    <w:p>
+      <w:pPr>
+        <w:rPr>
+          <w:rFonts w:hint="default"/>
+        </w:rPr>
+      </w:pPr>
+    </w:p>
+    <w:p>
+      <w:pPr>
+        <w:rPr>
+          <w:rFonts w:hint="default"/>
+        </w:rPr>
+      </w:pPr>
+    </w:p>
+    <w:p>
+      <w:pPr>
+        <w:rPr>
+          <w:rFonts w:hint="default"/>
+        </w:rPr>
+      </w:pPr>
+    </w:p>
+    <w:p>
+      <w:pPr>
+        <w:rPr>
+          <w:rFonts w:hint="default"/>
+        </w:rPr>
+      </w:pPr>
+    </w:p>
+    <w:p>
+      <w:pPr>
+        <w:rPr>
+          <w:rFonts w:hint="default"/>
+        </w:rPr>
+      </w:pPr>
+    </w:p>
+    <w:p>
+      <w:pPr>
+        <w:rPr>
+          <w:rFonts w:hint="default"/>
+        </w:rPr>
+      </w:pPr>
+    </w:p>
+    <w:p>
+      <w:pPr>
+        <w:rPr>
+          <w:rFonts w:hint="default"/>
+        </w:rPr>
+      </w:pPr>
+    </w:p>
+    <w:p>
+      <w:pPr>
+        <w:rPr>
+          <w:rFonts w:hint="default"/>
+        </w:rPr>
+      </w:pPr>
+    </w:p>
+    <w:p>
+      <w:pPr>
+        <w:rPr>
+          <w:rFonts w:hint="default"/>
+        </w:rPr>
+      </w:pPr>
+    </w:p>
+    <w:p>
+      <w:pPr>
+        <w:rPr>
+          <w:rFonts w:hint="default"/>
+        </w:rPr>
+      </w:pPr>
+    </w:p>
+    <w:p>
+      <w:pPr>
+        <w:rPr>
+          <w:rFonts w:hint="default"/>
+        </w:rPr>
+      </w:pPr>
     </w:p>
     <w:p>
       <w:pPr>
@@ -2849,8 +3321,6 @@
         </w:rPr>
         <w:t>→ entry_repo.Create()              # 事务内写入 header + lines</w:t>
       </w:r>
-      <w:bookmarkStart w:id="0" w:name="_GoBack"/>
-      <w:bookmarkEnd w:id="0"/>
     </w:p>
     <w:sectPr>
       <w:pgSz w:w="11906" w:h="16838"/>
@@ -2867,7 +3337,7 @@
   <w:docDefaults>
     <w:rPrDefault>
       <w:rPr>
-        <w:rFonts w:asciiTheme="minorHAnsi" w:hAnsiTheme="minorHAnsi" w:eastAsiaTheme="minorEastAsia" w:cstheme="minorBidi"/>
+        <w:rFonts w:ascii="Times New Roman" w:hAnsi="Times New Roman" w:eastAsia="SimSun" w:cs="Times New Roman"/>
       </w:rPr>
     </w:rPrDefault>
     <w:pPrDefault/>
@@ -2972,7 +3442,7 @@
     <w:lsdException w:unhideWhenUsed="0" w:uiPriority="0" w:semiHidden="0" w:name="HTML Code"/>
     <w:lsdException w:unhideWhenUsed="0" w:uiPriority="0" w:semiHidden="0" w:name="HTML Definition"/>
     <w:lsdException w:unhideWhenUsed="0" w:uiPriority="0" w:semiHidden="0" w:name="HTML Keyboard"/>
-    <w:lsdException w:unhideWhenUsed="0" w:uiPriority="0" w:semiHidden="0" w:name="HTML Preformatted"/>
+    <w:lsdException w:qFormat="1" w:unhideWhenUsed="0" w:uiPriority="0" w:semiHidden="0" w:name="HTML Preformatted"/>
     <w:lsdException w:unhideWhenUsed="0" w:uiPriority="0" w:semiHidden="0" w:name="HTML Sample"/>
     <w:lsdException w:unhideWhenUsed="0" w:uiPriority="0" w:semiHidden="0" w:name="HTML Typewriter"/>
     <w:lsdException w:unhideWhenUsed="0" w:uiPriority="0" w:semiHidden="0" w:name="HTML Variable"/>
@@ -3150,6 +3620,39 @@
         <w:right w:w="108" w:type="dxa"/>
       </w:tblCellMar>
     </w:tblPr>
+  </w:style>
+  <w:style w:type="paragraph" w:styleId="4">
+    <w:name w:val="HTML Preformatted"/>
+    <w:qFormat/>
+    <w:uiPriority w:val="0"/>
+    <w:pPr>
+      <w:tabs>
+        <w:tab w:val="left" w:pos="916"/>
+        <w:tab w:val="left" w:pos="1832"/>
+        <w:tab w:val="left" w:pos="2748"/>
+        <w:tab w:val="left" w:pos="3664"/>
+        <w:tab w:val="left" w:pos="4580"/>
+        <w:tab w:val="left" w:pos="5496"/>
+        <w:tab w:val="left" w:pos="6412"/>
+        <w:tab w:val="left" w:pos="7328"/>
+        <w:tab w:val="left" w:pos="8244"/>
+        <w:tab w:val="left" w:pos="9160"/>
+        <w:tab w:val="left" w:pos="10076"/>
+        <w:tab w:val="left" w:pos="10992"/>
+        <w:tab w:val="left" w:pos="11908"/>
+        <w:tab w:val="left" w:pos="12824"/>
+        <w:tab w:val="left" w:pos="13740"/>
+        <w:tab w:val="left" w:pos="14656"/>
+      </w:tabs>
+      <w:jc w:val="left"/>
+    </w:pPr>
+    <w:rPr>
+      <w:rFonts w:hint="eastAsia" w:ascii="SimSun" w:hAnsi="SimSun" w:eastAsia="SimSun" w:cs="SimSun"/>
+      <w:kern w:val="0"/>
+      <w:sz w:val="24"/>
+      <w:szCs w:val="24"/>
+      <w:lang w:val="en-US" w:eastAsia="zh-CN" w:bidi="ar"/>
+    </w:rPr>
   </w:style>
 </w:styles>
 </file>

</xml_diff>

<commit_message>
Advance ERP workflows and admin authorization
</commit_message>
<xml_diff>
--- a/StartServer.docx
+++ b/StartServer.docx
@@ -49,30 +49,17 @@
     <w:p>
       <w:pPr>
         <w:rPr>
-          <w:rFonts w:hint="default"/>
-          <w:lang w:val="en-US"/>
-        </w:rPr>
-      </w:pPr>
-    </w:p>
-    <w:p>
-      <w:pPr>
-        <w:rPr>
-          <w:rFonts w:hint="default"/>
-        </w:rPr>
-      </w:pPr>
-      <w:r>
-        <w:rPr>
-          <w:rFonts w:hint="default"/>
-        </w:rPr>
-        <w:t>启动顺序</w:t>
-      </w:r>
-    </w:p>
-    <w:p>
-      <w:pPr>
-        <w:rPr>
-          <w:rFonts w:hint="default"/>
-        </w:rPr>
-      </w:pPr>
+          <w:rFonts w:hint="eastAsia"/>
+          <w:lang w:val="en-US" w:eastAsia="zh-CN"/>
+        </w:rPr>
+      </w:pPr>
+      <w:r>
+        <w:rPr>
+          <w:rFonts w:hint="eastAsia"/>
+          <w:lang w:val="en-US" w:eastAsia="zh-CN"/>
+        </w:rPr>
+        <w:t>编译：</w:t>
+      </w:r>
     </w:p>
     <w:p>
       <w:pPr>
@@ -81,6 +68,8 @@
         <w:widowControl/>
         <w:suppressLineNumbers w:val="0"/>
         <w:jc w:val="left"/>
+      </w:pPr>
+      <w:r>
         <w:rPr>
           <w:rFonts w:ascii="SimSun" w:hAnsi="SimSun" w:eastAsia="SimSun" w:cs="SimSun"/>
           <w:kern w:val="0"/>
@@ -88,8 +77,60 @@
           <w:szCs w:val="24"/>
           <w:lang w:val="en-US" w:eastAsia="zh-CN" w:bidi="ar"/>
         </w:rPr>
-      </w:pPr>
-      <w:r>
+        <w:t>go build -o bin\auth-service.exe .\cmd\auth-service\</w:t>
+      </w:r>
+    </w:p>
+    <w:p>
+      <w:pPr>
+        <w:rPr>
+          <w:rFonts w:hint="default"/>
+          <w:lang w:val="en-US" w:eastAsia="zh-CN"/>
+        </w:rPr>
+      </w:pPr>
+    </w:p>
+    <w:p>
+      <w:pPr>
+        <w:rPr>
+          <w:rFonts w:hint="default"/>
+          <w:lang w:val="en-US"/>
+        </w:rPr>
+      </w:pPr>
+    </w:p>
+    <w:p>
+      <w:pPr>
+        <w:rPr>
+          <w:rFonts w:hint="default"/>
+          <w:lang w:val="en-US"/>
+        </w:rPr>
+      </w:pPr>
+    </w:p>
+    <w:p>
+      <w:pPr>
+        <w:rPr>
+          <w:rFonts w:hint="default"/>
+        </w:rPr>
+      </w:pPr>
+      <w:r>
+        <w:rPr>
+          <w:rFonts w:hint="default"/>
+        </w:rPr>
+        <w:t>启动顺序</w:t>
+      </w:r>
+    </w:p>
+    <w:p>
+      <w:pPr>
+        <w:rPr>
+          <w:rFonts w:hint="default"/>
+        </w:rPr>
+      </w:pPr>
+    </w:p>
+    <w:p>
+      <w:pPr>
+        <w:keepNext w:val="0"/>
+        <w:keepLines w:val="0"/>
+        <w:widowControl/>
+        <w:suppressLineNumbers w:val="0"/>
+        <w:jc w:val="left"/>
         <w:rPr>
           <w:rFonts w:ascii="SimSun" w:hAnsi="SimSun" w:eastAsia="SimSun" w:cs="SimSun"/>
           <w:kern w:val="0"/>
@@ -97,6 +138,15 @@
           <w:szCs w:val="24"/>
           <w:lang w:val="en-US" w:eastAsia="zh-CN" w:bidi="ar"/>
         </w:rPr>
+      </w:pPr>
+      <w:r>
+        <w:rPr>
+          <w:rFonts w:ascii="SimSun" w:hAnsi="SimSun" w:eastAsia="SimSun" w:cs="SimSun"/>
+          <w:kern w:val="0"/>
+          <w:sz w:val="24"/>
+          <w:szCs w:val="24"/>
+          <w:lang w:val="en-US" w:eastAsia="zh-CN" w:bidi="ar"/>
+        </w:rPr>
         <w:t>端口 8080 被占用了。先查是谁在用，然后清理</w:t>
       </w:r>
       <w:r>
@@ -151,7 +201,7 @@
     </w:p>
     <w:p>
       <w:pPr>
-        <w:pStyle w:val="4"/>
+        <w:pStyle w:val="5"/>
         <w:keepNext w:val="0"/>
         <w:keepLines w:val="0"/>
         <w:widowControl/>
@@ -185,8 +235,6 @@
           <w:lang w:val="en-US" w:eastAsia="zh-CN" w:bidi="ar"/>
         </w:rPr>
       </w:pPr>
-      <w:bookmarkStart w:id="0" w:name="_GoBack"/>
-      <w:bookmarkEnd w:id="0"/>
     </w:p>
     <w:p>
       <w:pPr>
@@ -246,7 +294,7 @@
     </w:p>
     <w:p>
       <w:pPr>
-        <w:pStyle w:val="4"/>
+        <w:pStyle w:val="5"/>
         <w:keepNext w:val="0"/>
         <w:keepLines w:val="0"/>
         <w:widowControl/>
@@ -258,7 +306,7 @@
     </w:p>
     <w:p>
       <w:pPr>
-        <w:pStyle w:val="4"/>
+        <w:pStyle w:val="5"/>
         <w:keepNext w:val="0"/>
         <w:keepLines w:val="0"/>
         <w:widowControl/>
@@ -297,7 +345,7 @@
     </w:p>
     <w:p>
       <w:pPr>
-        <w:pStyle w:val="4"/>
+        <w:pStyle w:val="5"/>
         <w:keepNext w:val="0"/>
         <w:keepLines w:val="0"/>
         <w:widowControl/>
@@ -336,7 +384,7 @@
     </w:p>
     <w:p>
       <w:pPr>
-        <w:pStyle w:val="4"/>
+        <w:pStyle w:val="5"/>
         <w:keepNext w:val="0"/>
         <w:keepLines w:val="0"/>
         <w:widowControl/>
@@ -348,66 +396,29 @@
     </w:p>
     <w:p>
       <w:pPr>
-        <w:pStyle w:val="4"/>
+        <w:pStyle w:val="5"/>
         <w:keepNext w:val="0"/>
         <w:keepLines w:val="0"/>
         <w:widowControl/>
         <w:suppressLineNumbers w:val="0"/>
       </w:pPr>
       <w:r>
-        <w:t>go run .\cmd\api-gateway</w:t>
-      </w:r>
-    </w:p>
-    <w:p>
-      <w:pPr>
+        <w:rPr>
+          <w:rStyle w:val="4"/>
+        </w:rPr>
+        <w:t>go run ./cmd/auth-service</w:t>
+      </w:r>
+    </w:p>
+    <w:p>
+      <w:pPr>
+        <w:pStyle w:val="5"/>
         <w:keepNext w:val="0"/>
         <w:keepLines w:val="0"/>
         <w:widowControl/>
         <w:suppressLineNumbers w:val="0"/>
-        <w:jc w:val="left"/>
-      </w:pPr>
-      <w:r>
-        <w:rPr>
-          <w:rFonts w:hint="eastAsia" w:ascii="SimSun" w:hAnsi="SimSun" w:eastAsia="SimSun" w:cs="SimSun"/>
-          <w:kern w:val="0"/>
-          <w:sz w:val="24"/>
-          <w:szCs w:val="24"/>
-          <w:lang w:val="en-US" w:eastAsia="zh-CN" w:bidi="ar"/>
-        </w:rPr>
-        <w:t>g</w:t>
-      </w:r>
-      <w:r>
-        <w:rPr>
-          <w:rFonts w:ascii="SimSun" w:hAnsi="SimSun" w:eastAsia="SimSun" w:cs="SimSun"/>
-          <w:kern w:val="0"/>
-          <w:sz w:val="24"/>
-          <w:szCs w:val="24"/>
-          <w:lang w:val="en-US" w:eastAsia="zh-CN" w:bidi="ar"/>
-        </w:rPr>
-        <w:t xml:space="preserve">o run </w:t>
-      </w:r>
-      <w:r>
-        <w:rPr>
-          <w:rFonts w:hint="default" w:ascii="SimSun" w:hAnsi="SimSun" w:eastAsia="SimSun" w:cs="SimSun"/>
-          <w:kern w:val="0"/>
-          <w:sz w:val="24"/>
-          <w:szCs w:val="24"/>
-          <w:lang w:val="en-US" w:eastAsia="zh-CN" w:bidi="ar"/>
-        </w:rPr>
-        <w:t>.</w:t>
-      </w:r>
-      <w:r>
-        <w:t>\cmd\auth-service</w:t>
-      </w:r>
-    </w:p>
-    <w:p>
-      <w:pPr>
-        <w:pStyle w:val="4"/>
-        <w:keepNext w:val="0"/>
-        <w:keepLines w:val="0"/>
-        <w:widowControl/>
-        <w:suppressLineNumbers w:val="0"/>
-      </w:pPr>
+      </w:pPr>
+      <w:bookmarkStart w:id="0" w:name="_GoBack"/>
+      <w:bookmarkEnd w:id="0"/>
     </w:p>
     <w:p>
       <w:pPr>
@@ -3621,7 +3632,17 @@
       </w:tblCellMar>
     </w:tblPr>
   </w:style>
-  <w:style w:type="paragraph" w:styleId="4">
+  <w:style w:type="character" w:styleId="4">
+    <w:name w:val="HTML Code"/>
+    <w:basedOn w:val="2"/>
+    <w:uiPriority w:val="0"/>
+    <w:rPr>
+      <w:rFonts w:ascii="Courier New" w:hAnsi="Courier New" w:cs="Courier New"/>
+      <w:sz w:val="20"/>
+      <w:szCs w:val="20"/>
+    </w:rPr>
+  </w:style>
+  <w:style w:type="paragraph" w:styleId="5">
     <w:name w:val="HTML Preformatted"/>
     <w:qFormat/>
     <w:uiPriority w:val="0"/>

</xml_diff>